<commit_message>
Toma de 4 dias completa: resumen, dashboard e informe actualizados
</commit_message>
<xml_diff>
--- a/Informe_Laboratorio5.docx
+++ b/Informe_Laboratorio5.docx
@@ -2305,7 +2305,7 @@
                 <w:i w:val="0"/>
                 <w:sz w:val="14"/>
               </w:rPr>
-              <w:t>88</w:t>
+              <w:t>37 185</w:t>
             </w:r>
           </w:p>
         </w:tc>
@@ -2330,7 +2330,7 @@
                 <w:i w:val="0"/>
                 <w:sz w:val="14"/>
               </w:rPr>
-              <w:t>99</w:t>
+              <w:t>37 196</w:t>
             </w:r>
           </w:p>
         </w:tc>
@@ -2355,7 +2355,7 @@
                 <w:i w:val="0"/>
                 <w:sz w:val="14"/>
               </w:rPr>
-              <w:t>88.89 %</w:t>
+              <w:t>99.97 %</w:t>
             </w:r>
           </w:p>
         </w:tc>
@@ -2486,7 +2486,7 @@
                 <w:i w:val="0"/>
                 <w:sz w:val="14"/>
               </w:rPr>
-              <w:t>97</w:t>
+              <w:t>37 195</w:t>
             </w:r>
           </w:p>
         </w:tc>
@@ -2512,7 +2512,7 @@
                 <w:i w:val="0"/>
                 <w:sz w:val="14"/>
               </w:rPr>
-              <w:t>97</w:t>
+              <w:t>37 195</w:t>
             </w:r>
           </w:p>
         </w:tc>
@@ -2666,7 +2666,7 @@
                 <w:i w:val="0"/>
                 <w:sz w:val="14"/>
               </w:rPr>
-              <w:t>98</w:t>
+              <w:t>37 195</w:t>
             </w:r>
           </w:p>
         </w:tc>
@@ -2691,7 +2691,7 @@
                 <w:i w:val="0"/>
                 <w:sz w:val="14"/>
               </w:rPr>
-              <w:t>98</w:t>
+              <w:t>37 195</w:t>
             </w:r>
           </w:p>
         </w:tc>
@@ -2757,7 +2757,7 @@
           <w:i w:val="0"/>
           <w:sz w:val="17"/>
         </w:rPr>
-        <w:t>Inicio: 2026-10-13 00:35:20</w:t>
+        <w:t>Toma completa:</w:t>
       </w:r>
       <w:r>
         <w:rPr>
@@ -2765,7 +2765,7 @@
           <w:i w:val="0"/>
           <w:sz w:val="17"/>
         </w:rPr>
-        <w:t xml:space="preserve"> (hora de Bogotá). </w:t>
+        <w:t xml:space="preserve"> inicio </w:t>
       </w:r>
       <w:r>
         <w:rPr>
@@ -2773,7 +2773,7 @@
           <w:i w:val="0"/>
           <w:sz w:val="17"/>
         </w:rPr>
-        <w:t>Fin previsto: 2026-10-17 00:35.</w:t>
+        <w:t>2026-10-13 00:35:20</w:t>
       </w:r>
       <w:r>
         <w:rPr>
@@ -2781,7 +2781,7 @@
           <w:i w:val="0"/>
           <w:sz w:val="17"/>
         </w:rPr>
-        <w:t xml:space="preserve"> </w:t>
+        <w:t xml:space="preserve">, fin </w:t>
       </w:r>
       <w:r>
         <w:rPr>
@@ -2789,7 +2789,7 @@
           <w:i w:val="0"/>
           <w:sz w:val="17"/>
         </w:rPr>
-        <w:t>Fecha de corte de este informe: 2026-10-13 01:00:04</w:t>
+        <w:t>2026-10-19 11:34:21</w:t>
       </w:r>
       <w:r>
         <w:rPr>
@@ -2797,7 +2797,39 @@
           <w:i w:val="0"/>
           <w:sz w:val="17"/>
         </w:rPr>
-        <w:t xml:space="preserve"> (0.41 h de toma); la toma sigue corriendo en la VM y la captura de la ventana completa se adjunta al entregar.</w:t>
+        <w:t xml:space="preserve"> (hora de Bogotá; ahí se detuvieron los publicadores) = </w:t>
+      </w:r>
+      <w:r>
+        <w:rPr>
+          <w:b/>
+          <w:i w:val="0"/>
+          <w:sz w:val="17"/>
+        </w:rPr>
+        <w:t>6.46 días</w:t>
+      </w:r>
+      <w:r>
+        <w:rPr>
+          <w:b w:val="0"/>
+          <w:i w:val="0"/>
+          <w:sz w:val="17"/>
+        </w:rPr>
+        <w:t xml:space="preserve"> continuos. La ventana de 4 días que se entrega es </w:t>
+      </w:r>
+      <w:r>
+        <w:rPr>
+          <w:b/>
+          <w:i w:val="0"/>
+          <w:sz w:val="17"/>
+        </w:rPr>
+        <w:t>13-oct 00:35 → 17-oct 00:35</w:t>
+      </w:r>
+      <w:r>
+        <w:rPr>
+          <w:b w:val="0"/>
+          <w:i w:val="0"/>
+          <w:sz w:val="17"/>
+        </w:rPr>
+        <w:t xml:space="preserve"> (Fig. 2); la toma siguió corriendo hasta el fin indicado.</w:t>
       </w:r>
     </w:p>
     <w:p>
@@ -3381,7 +3413,7 @@
             <w:r>
               <w:drawing>
                 <wp:inline xmlns:a="http://schemas.openxmlformats.org/drawingml/2006/main" xmlns:pic="http://schemas.openxmlformats.org/drawingml/2006/picture">
-                  <wp:extent cx="5400000" cy="3557647"/>
+                  <wp:extent cx="5400000" cy="3176471"/>
                   <wp:docPr id="2" name="Picture 2"/>
                   <wp:cNvGraphicFramePr>
                     <a:graphicFrameLocks noChangeAspect="1"/>
@@ -3402,7 +3434,7 @@
                         <pic:spPr>
                           <a:xfrm>
                             <a:off x="0" y="0"/>
-                            <a:ext cx="5400000" cy="3557647"/>
+                            <a:ext cx="5400000" cy="3176471"/>
                           </a:xfrm>
                           <a:prstGeom prst="rect"/>
                         </pic:spPr>
@@ -3434,7 +3466,16 @@
                 <w:color w:val="555B66"/>
                 <w:sz w:val="14"/>
               </w:rPr>
-              <w:t xml:space="preserve"> Dashboard de Grafana con la toma desde su inicio hasta la fecha de corte: </w:t>
+              <w:t xml:space="preserve"> Dashboard de Grafana con la </w:t>
+            </w:r>
+            <w:r>
+              <w:rPr>
+                <w:b/>
+                <w:i/>
+                <w:color w:val="555B66"/>
+                <w:sz w:val="14"/>
+              </w:rPr>
+              <w:t>ventana de 4 días</w:t>
             </w:r>
             <w:r>
               <w:rPr>
@@ -3443,16 +3484,7 @@
                 <w:color w:val="555B66"/>
                 <w:sz w:val="14"/>
               </w:rPr>
-              <w:t>gauges</w:t>
-            </w:r>
-            <w:r>
-              <w:rPr>
-                <w:b w:val="0"/>
-                <w:i/>
-                <w:color w:val="555B66"/>
-                <w:sz w:val="14"/>
-              </w:rPr>
-              <w:t xml:space="preserve"> con unidad y rango, series de las 3 variables con el umbral, y el pico forzado de 41 °C con las marcas Pending (amarillo), Firing (rojo) y Normal (verde).</w:t>
+              <w:t xml:space="preserve"> (13-oct 00:35 → 17-oct 00:35): ciclo día/noche de las 3 variables en los 3 nodos, umbrales en rojo y el pico forzado de la alerta el primer día.</w:t>
             </w:r>
           </w:p>
         </w:tc>

</xml_diff>